<commit_message>
New translations module 1 - welcome session.docx (Papiamento)
</commit_message>
<xml_diff>
--- a/translations/plh_facilitator_cw/pap/pap_Module 1 - Welcome Session.docx
+++ b/translations/plh_facilitator_cw/pap/pap_Module 1 - Welcome Session.docx
@@ -19,7 +19,7 @@
       </w:pPr>
       <w:r>
         <w:br w:type="textWrapping"/>
-        <w:t xml:space="preserve">Risibí kada mayor ku kariño i entusiasmo ora nan yega na e seshon. </w:t>
+        <w:t xml:space="preserve">Risibí kada mayor/edukadó ku kariño i entusiasmo ora nan yega na e seshon. </w:t>
       </w:r>
     </w:p>
     <w:p>
@@ -27,7 +27,7 @@
         <w:spacing w:line="360" w:lineRule="auto"/>
       </w:pPr>
       <w:r>
-        <w:t xml:space="preserve">Puntra mayornan si nan a pensa riba un meta ku nan a menshoná durante e yamada/mensahe individual promé ku e seshonnan di grupo en persona a kuminsá.</w:t>
+        <w:t xml:space="preserve">Puntra mayornan/edukadónan si nan a pensa riba un meta ku nan a menshoná durante e yamada/mensahe individual promé ku e seshonnan di grupo en persona a kuminsá.</w:t>
         <w:br w:type="textWrapping"/>
       </w:r>
     </w:p>
@@ -39,7 +39,7 @@
       <w:bookmarkStart w:colFirst="0" w:colLast="0" w:name="_s7pkvrdav4ml" w:id="1"/>
       <w:bookmarkEnd w:id="1"/>
       <w:r>
-        <w:t xml:space="preserve">PLACHI DI NÒMBER</w:t>
+        <w:t xml:space="preserve">PLACHI DI NOMBER</w:t>
       </w:r>
     </w:p>
     <w:p>
@@ -47,7 +47,7 @@
         <w:spacing w:line="360" w:lineRule="auto"/>
       </w:pPr>
       <w:r>
-        <w:t xml:space="preserve">Duna kada mayor un plachi di nòmber pa asina tur hende siña e nòmbernan di otronan den e grupo. Tambe ta importante pa bo demonstrá e prinsipio di uso di nòmber pa asina mayornan hasi esaki ku nan mes yunan.</w:t>
+        <w:t xml:space="preserve">Duna kada mayor/edukadó un plachi di nòmber pa asina tur hende siña e nòmbernan di otronan den e grupo. Tambe ta importante pa bo demonstrá e prinsipio di usa nòmber pa asina mayornan/edukadónan hasi esaki ku nan mes yunan.</w:t>
       </w:r>
     </w:p>
     <w:p>
@@ -75,7 +75,7 @@
         <w:t xml:space="preserve">Tuma un Pousa</w:t>
       </w:r>
       <w:r>
-        <w:t xml:space="preserve"> ku e mayornan. Bo por hasié kòrtiku (mas o ménos un minüt):</w:t>
+        <w:t xml:space="preserve"> ku e mayornan/edukadónan. Bo por hasié kòrtiku (mas o ménos un minüt):</w:t>
       </w:r>
     </w:p>
     <w:p>
@@ -183,7 +183,7 @@
         <w:spacing w:line="360" w:lineRule="auto"/>
       </w:pPr>
       <w:r>
-        <w:t xml:space="preserve">Instruí mayornan den un seri di moveshonnan pasando dor di e kurpa di kabes te pia. </w:t>
+        <w:t xml:space="preserve">Instruí mayornan/edukadónan den un seri di moveshonnan pasando dor di e kurpa di kabes te pia. </w:t>
       </w:r>
     </w:p>
     <w:p>
@@ -191,7 +191,7 @@
         <w:spacing w:line="360" w:lineRule="auto"/>
       </w:pPr>
       <w:r>
-        <w:t xml:space="preserve">Ora di siña e ehersisionan físiko ku mayornan pa promé bia, bo mester tin pasenshi i bo mester splika kada moveshon bon kla. </w:t>
+        <w:t xml:space="preserve">Ora bo ta siña mayornan/edukadónan e ehersisionan físiko e promé bia, bo mester tin pasenshi i bo mester splika kada moveshon bon kla. </w:t>
       </w:r>
     </w:p>
     <w:p>
@@ -212,7 +212,7 @@
         <w:spacing w:line="360" w:lineRule="auto"/>
       </w:pPr>
       <w:r>
-        <w:t xml:space="preserve">Hopi di e mayornan no ta kustumbrá di move nan kurpa i lo tin mester di enkurashamentu i mas guia ku bo ta spera. </w:t>
+        <w:t xml:space="preserve">Hopi di e mayornan/edukadónan no ta kustumbrá di move nan kurpa i lo mester enkurashá i guia nan, mas ku bo ta spera. </w:t>
       </w:r>
     </w:p>
     <w:p>
@@ -220,7 +220,7 @@
         <w:spacing w:line="360" w:lineRule="auto"/>
       </w:pPr>
       <w:r>
-        <w:t xml:space="preserve">Si un hende mester sinta, bo mester enkurash'é pa partisipá mas mihó posibel for di un posishon sintá. </w:t>
+        <w:t xml:space="preserve">Si un hende mester sinta, bo mester enkurash'é pa e partisipá mas mihó posibel sintá. </w:t>
       </w:r>
     </w:p>
     <w:p>
@@ -264,7 +264,7 @@
         <w:spacing w:line="360" w:lineRule="auto"/>
       </w:pPr>
       <w:r>
-        <w:t xml:space="preserve">Segun bo ta guia ehersisionan kada seshon, e mayornan gradualmente lo bira mas kómodo ku e moveshonnan</w:t>
+        <w:t xml:space="preserve">Segun bo ta guia e ehersisionan durante kada seshon, e mayornan/edukadónan gradualmente lo bira mas kómodo ku e moveshonnan</w:t>
       </w:r>
     </w:p>
     <w:p>
@@ -277,7 +277,7 @@
         <w:pStyle w:val="P68B1DB1-Normal1"/>
       </w:pPr>
       <w:r>
-        <w:t xml:space="preserve">Enkurashá mayornan pa hasi e ehersisionan físiko na kas riba un base kontínuo. </w:t>
+        <w:t xml:space="preserve">Enkurashá mayornan/edukadónan pa hasi e ehersisionan físiko na kas riba un base kontínuo. </w:t>
       </w:r>
     </w:p>
     <w:p>
@@ -479,7 +479,7 @@
               <w:jc w:val="center"/>
             </w:pPr>
             <w:r>
-              <w:t xml:space="preserve">Strèk den bo bandanan robes i drechi </w:t>
+              <w:t xml:space="preserve">Strèk na banda robes i drechi </w:t>
             </w:r>
           </w:p>
           <w:p>
@@ -1081,7 +1081,7 @@
               <w:jc w:val="center"/>
             </w:pPr>
             <w:r>
-              <w:t xml:space="preserve">Laga tur kos lòs, suplando rosea saka afó usando zonido duru. (4 biaha)</w:t>
+              <w:t xml:space="preserve">Laga tur kos lòs, supla rosea saka afó ku zonido duru. (4 biaha)</w:t>
             </w:r>
           </w:p>
         </w:tc>
@@ -1711,7 +1711,7 @@
               <w:jc w:val="center"/>
             </w:pPr>
             <w:r>
-              <w:t xml:space="preserve">Pone un pia riba suela bo dilanti. Drei bo ènkel manda pafó i paden. Despues di 4 sírkulo den direkshon, kambia di pia. </w:t>
+              <w:t xml:space="preserve">Pone un pia riba suela bo dilanti. Drei bo ènkel manda pafó i paden. Despues di 4 sírkulo den kada direkshon, kambia di pia. </w:t>
             </w:r>
           </w:p>
         </w:tc>
@@ -2226,7 +2226,7 @@
               <w:pStyle w:val="P68B1DB1-Normal2"/>
             </w:pPr>
             <w:r>
-              <w:t xml:space="preserve">Halamentu Final di Rosea</w:t>
+              <w:t xml:space="preserve">Hala Rosea na Final</w:t>
             </w:r>
           </w:p>
         </w:tc>
@@ -2322,7 +2322,7 @@
               <w:jc w:val="center"/>
             </w:pPr>
             <w:r>
-              <w:t xml:space="preserve">Hisa bo brasanan riba bo kabes halando rosea aden. Pokopoko laga bo mannan baha bai abou banda di bo, segun ku bo ta hala rosea afó. Para ku bo wowonan será i nota kon bo kurpa ta sinti awor. </w:t>
+              <w:t xml:space="preserve">Hisa bo brasanan riba bo kabes i hala rosea aden. Pokopoko baha bo mannan abou na banda di bo kurpa, segun ku bo ta saka rosea afó. Para ku bo wowonan será i nota kon bo kurpa ta sinti awor. </w:t>
             </w:r>
           </w:p>
         </w:tc>
@@ -2441,7 +2441,7 @@
         <w:spacing w:after="200" w:line="360" w:lineRule="auto"/>
       </w:pPr>
       <w:r>
-        <w:t xml:space="preserve">Perkurá pa menshoná tur komponente di e programa i enfatisá e importansia di kon e vários seshonnan por agregá balor pa e partisipantenan.</w:t>
+        <w:t xml:space="preserve">Sòru menshoná tur komponente di e programa i enfatisá e importansia di e balor agregá ku e vários seshonnan por duna e partisipantenan.</w:t>
       </w:r>
     </w:p>
     <w:p>
@@ -2493,7 +2493,7 @@
         <w:spacing w:after="200" w:line="360" w:lineRule="auto"/>
       </w:pPr>
       <w:r>
-        <w:t xml:space="preserve">Establesé Reglanan Básiko pa yuda hasi e programa un lugá seif pa siña huntu. Pidi e partisipantenan pa pensa kiko ta importante pa nan sinti nan mes kómodo i respetá, i pa sinti nan mes seif i sostené den e grupo. </w:t>
+        <w:t xml:space="preserve">Establesé Reglanan Básiko pa yuda hasi e programa un lugá seif pa siña huntu. Pidi e partisipantenan pa pensa kiko ta importante pa nan por sinti nan mes kómodo i respetá, i pa sinti nan mes seif i sostené den e grupo. </w:t>
       </w:r>
     </w:p>
     <w:p>
@@ -2514,7 +2514,7 @@
         <w:fldChar w:fldCharType="end"/>
       </w:r>
       <w:r>
-        <w:t xml:space="preserve"> ta un programa spesial! E ta trese edukadónan huntu pa siña i kompartí eksperenshanan komun di edukashon familiar ku otro. Ta importante pa e grupo pone reglanan básiko tokante kon nan lo sòru pa nan tempu i eksperenshanan huntu ta fruktífero. Mester desaroyá e reglanan aki komo un grupo i e grupo mester karga nan. </w:t>
+        <w:t xml:space="preserve"> ta un programa spesial! E ta trese mayornan/edukadónan huntu pa siña i kompartí eksperenshanan komun di edukashon familiar ku otro. Ta importante pa e grupo pone reglanan básiko tokante kon nan lo sòru pa nan tempu i eksperenshanan huntu ta fruktífero. Mester desaroyá e reglanan aki komo grupo i e grupo mester karga nan. </w:t>
       </w:r>
     </w:p>
     <w:p>
@@ -2523,7 +2523,7 @@
         <w:spacing w:after="200" w:line="360" w:lineRule="auto"/>
       </w:pPr>
       <w:r>
-        <w:t xml:space="preserve">Reglanan básiko tambe ta útil pa yuda bo dirigí e seshonnan akí komo fasilitadó. Nan por ta útil ora di rekordá partisipantenan ku </w:t>
+        <w:t xml:space="preserve">Reglanan básiko tambe ta útil pa yudá bo dirigí e seshonnan akí komo fasilitadó. Nan por ta útil ora di rekordá partisipantenan ku </w:t>
       </w:r>
       <w:r>
         <w:rPr>
@@ -2654,7 +2654,7 @@
         <w:pStyle w:val="P68B1DB1-Normal3"/>
       </w:pPr>
       <w:r>
-        <w:t xml:space="preserve">Tene na kuenta: Bo por agregá mas regla básiko na e listanan despues den e seshon ora ku e partisipantenan ta komprondé e komponentenan di e programa mihó.</w:t>
+        <w:t xml:space="preserve">Tene na kuenta: Bo por agregá, despues den e seshon, mas regla básiko na e listanan ora ku e partisipantenan ta komprondé e komponentenan di e programa mihó.</w:t>
       </w:r>
     </w:p>
     <w:p>
@@ -2680,7 +2680,7 @@
         <w:t xml:space="preserve">Sòru pa Reglanan Básiko deskribí un komportashon positivo. </w:t>
       </w:r>
       <w:r>
-        <w:t xml:space="preserve">Por ehèmpel, en bes di tin un regla pa seshonnan en persona di ‘No papia na bo telefòn durante e seshon di grupo,’ e regla por ta ‘Tene bo telefòn riba modo silensioso i tuma kualke yamada di telefòn urgente pafó di e sala di entrenamentu.’</w:t>
+        <w:t xml:space="preserve">Por ehèmpel, na lugá di e regla pa seshonnan en persona di ‘No papia na bo telefòn durante e seshon di grupo,’ e regla por ta ‘Tene bo telefòn riba modo silensioso i tuma kualke yamada di telefòn urgente pafó di e sala di entrenamentu.’</w:t>
       </w:r>
     </w:p>
     <w:p>
@@ -2699,7 +2699,7 @@
         </w:rPr>
       </w:pPr>
       <w:r>
-        <w:t xml:space="preserve">Bo por pidi partisipantenan pa krea reglanan riba asuntunan spesífiko manera yega na tempu, uso di telefòn selular, rèspèt, konfidensialidat, èts.</w:t>
+        <w:t xml:space="preserve">Bo por pidi partisipantenan pa traha reglanan riba asuntunan spesífiko manera yega na tempu, uso di telefòn selular, rèspèt, konfidensialidat, èts.</w:t>
       </w:r>
     </w:p>
     <w:p>

</xml_diff>